<commit_message>
sync docs and add business-rules
</commit_message>
<xml_diff>
--- a/docs/04-scenerio/ledger.docx
+++ b/docs/04-scenerio/ledger.docx
@@ -1,6 +1,6 @@
 
 <file path=word/document.xml><?xml version="1.0" encoding="utf-8"?>
-<w:document xmlns:wpc="http://schemas.microsoft.com/office/word/2010/wordprocessingCanvas" xmlns:mc="http://schemas.openxmlformats.org/markup-compatibility/2006" xmlns:o="urn:schemas-microsoft-com:office:office" xmlns:r="http://schemas.openxmlformats.org/officeDocument/2006/relationships" xmlns:m="http://schemas.openxmlformats.org/officeDocument/2006/math" xmlns:v="urn:schemas-microsoft-com:vml" xmlns:wp="http://schemas.openxmlformats.org/drawingml/2006/wordprocessingDrawing" xmlns:w="http://schemas.openxmlformats.org/wordprocessingml/2006/main" xmlns:wpg="http://schemas.microsoft.com/office/word/2010/wordprocessingGroup" xmlns:wpi="http://schemas.microsoft.com/office/word/2010/wordprocessingInk" xmlns:a="http://schemas.openxmlformats.org/drawingml/2006/main" xmlns:wne="http://schemas.microsoft.com/office/word/2006/wordml" xmlns:wps="http://schemas.microsoft.com/office/word/2010/wordprocessingShape" xmlns:w10="urn:schemas-microsoft-com:office:word" xmlns:wp14="http://schemas.microsoft.com/office/word/2010/wordprocessingDrawing" xmlns:w14="http://schemas.microsoft.com/office/word/2010/wordml" xmlns:w15="http://schemas.microsoft.com/office/word/2012/wordml" xmlns:w16cex="http://schemas.microsoft.com/office/word/2018/wordml/cex" xmlns:w16cid="http://schemas.microsoft.com/office/word/2016/wordml/cid" xmlns:w16="http://schemas.microsoft.com/office/word/2018/wordml" xmlns:w16sdtdh="http://schemas.microsoft.com/office/word/2020/wordml/sdtdatahash" xmlns:w16se="http://schemas.microsoft.com/office/word/2015/wordml/symex" mc:Ignorable="w14 w15 w16se w16cid w16 w16cex w16sdtdh wp14">
+<w:document xmlns:mc="http://schemas.openxmlformats.org/markup-compatibility/2006" xmlns:w="http://schemas.openxmlformats.org/wordprocessingml/2006/main" xmlns:w14="http://schemas.microsoft.com/office/word/2010/wordml" mc:Ignorable="w14 w15 w16se w16cid w16 w16cex w16sdtdh wp14">
   <w:body>
     <w:p>
       <w:pPr>
@@ -95,12 +95,8 @@
               <w:rPr/>
             </w:pPr>
             <w:r>
-              <w:rPr>
-                <w:rtl w:val="0"/>
-              </w:rPr>
-              <w:t xml:space="preserve">ghi nhận biến động số dư </w:t>
+              <w:t>Ghi nhận biến động số dư</w:t>
             </w:r>
-            <w:r/>
           </w:p>
         </w:tc>
       </w:tr>
@@ -158,12 +154,8 @@
               <w:rPr/>
             </w:pPr>
             <w:r>
-              <w:rPr>
-                <w:rtl w:val="0"/>
-              </w:rPr>
-              <w:t xml:space="preserve">Wallet, Deposit, Withdrawal hoặc Settlement Module</w:t>
+              <w:t>Module nghiệp vụ</w:t>
             </w:r>
-            <w:r/>
           </w:p>
         </w:tc>
       </w:tr>

</xml_diff>